<commit_message>
fix(lesson-01): correct admin rights wording in troubleshooting
Replace «прав тьютора» with «прав администратора» in Возможные
сложности; rebuild lesson 1 page from updated draft.
</commit_message>
<xml_diff>
--- a/modules/git-github/content/lesson_01.docx
+++ b/modules/git-github/content/lesson_01.docx
@@ -2168,15 +2168,7 @@
       </w:pPr>
       <w:r>
         <w:rPr/>
-        <w:t>Выполни команду git -</w:t>
-      </w:r>
-      <w:r>
-        <w:rPr/>
-        <w:t>v</w:t>
-      </w:r>
-      <w:r>
-        <w:rPr/>
-        <w:t xml:space="preserve"> и запиши номер своей версии Git.</w:t>
+        <w:t>Выполни команду git -v и запиши номер своей версии Git.</w:t>
       </w:r>
     </w:p>
     <w:p>
@@ -2190,15 +2182,7 @@
       </w:pPr>
       <w:r>
         <w:rPr/>
-        <w:t>Выполни команду git config -</w:t>
-      </w:r>
-      <w:r>
-        <w:rPr/>
-        <w:t>l</w:t>
-      </w:r>
-      <w:r>
-        <w:rPr/>
-        <w:t xml:space="preserve"> и проверь, что user.name и user.email указаны верно.</w:t>
+        <w:t>Выполни команду git config -l и проверь, что user.name и user.email указаны верно.</w:t>
       </w:r>
     </w:p>
     <w:p>
@@ -2762,7 +2746,15 @@
       </w:pPr>
       <w:r>
         <w:rPr/>
-        <w:t>На школьных компьютерах может не быть прав тьютора — тогда Git и VS Code должен установить тьютор заранее.</w:t>
+        <w:t xml:space="preserve">На школьных компьютерах может не быть прав </w:t>
+      </w:r>
+      <w:r>
+        <w:rPr/>
+        <w:t>администратора</w:t>
+      </w:r>
+      <w:r>
+        <w:rPr/>
+        <w:t xml:space="preserve"> — тогда Git и VS Code должен установить тьютор заранее.</w:t>
       </w:r>
     </w:p>
     <w:p>

</xml_diff>

<commit_message>
docs(lesson-01): use short git flags (-v, -l, -h)
Replace git --version / --list / --help with their short forms to
match the updated draft.
</commit_message>
<xml_diff>
--- a/modules/git-github/content/lesson_01.docx
+++ b/modules/git-github/content/lesson_01.docx
@@ -1475,7 +1475,7 @@
       </w:r>
       <w:r>
         <w:rPr/>
-        <w:t>вместе с Git устанавливается терминал Git Bash. Команда git --version показывает номер установленной версии — это самый простой способ проверить, что Git работает.</w:t>
+        <w:t>вместе с Git устанавливается терминал Git Bash. Команда git -v показывает номер установленной версии — это самый простой способ проверить, что Git работает.</w:t>
       </w:r>
     </w:p>
     <w:p>
@@ -1869,7 +1869,7 @@
       </w:r>
       <w:r>
         <w:rPr/>
-        <w:t>Git установлен, открывается Git Bash, команда git --version показывает версию, а в настройках записаны имя и e-mail ученика.</w:t>
+        <w:t>Git установлен, открывается Git Bash, команда git -v показывает версию, а в настройках записаны имя и e-mail ученика.</w:t>
       </w:r>
     </w:p>
     <w:p>
@@ -2526,7 +2526,7 @@
       </w:pPr>
       <w:r>
         <w:rPr/>
-        <w:t>Кратко повторить, что сделали: поняли, зачем нужен контроль версий, и установили Git и VS Code. Спросить нескольких учеников, какую версию Git показала команда git --version. Сказать, что на следующем уроке создадим свой первый репозиторий и сделаем первое сохранение-коммит. Выдать домашнее задание.</w:t>
+        <w:t>Кратко повторить, что сделали: поняли, зачем нужен контроль версий, и установили Git и VS Code. Спросить нескольких учеников, какую версию Git показала команда git -v. Сказать, что на следующем уроке создадим свой первый репозиторий и сделаем первое сохранение-коммит. Выдать домашнее задание.</w:t>
       </w:r>
     </w:p>
     <w:p>
@@ -2642,7 +2642,7 @@
       </w:pPr>
       <w:r>
         <w:rPr/>
-        <w:t>Выпиши три команды, которые мы использовали на уроке, и подпиши, что делает каждая (git --version, git config --global user.name, git config --list).</w:t>
+        <w:t>Выпиши три команды, которые мы использовали на уроке, и подпиши, что делает каждая (git -v, git config --global user.name, git config -l).</w:t>
       </w:r>
     </w:p>
     <w:p>
@@ -2854,7 +2854,7 @@
       </w:pPr>
       <w:r>
         <w:rPr/>
-        <w:t>Выполнить команду git --help и посмотреть, сколько у Git команд. Назвать две незнакомые.</w:t>
+        <w:t>Выполнить команду git -h и посмотреть, сколько у Git команд. Назвать две незнакомые.</w:t>
       </w:r>
     </w:p>
     <w:p>

</xml_diff>

<commit_message>
docs(lesson-01): fix Git Bash image and sync text with built lesson
Restore correct aspect ratio of the Git Bash screenshot and remove the
erroneous crop that hid the Start-menu panel.

Align table row to «Тема урока», and section headings to «Способы помощи
учащимся» and «Дополнительные задания (для тех, кто справился раньше)»
to match docs/lessons/lesson_01.md.
</commit_message>
<xml_diff>
--- a/modules/git-github/content/lesson_01.docx
+++ b/modules/git-github/content/lesson_01.docx
@@ -208,7 +208,7 @@
                 <w:szCs w:val="22"/>
                 <w:lang w:val="en-US" w:eastAsia="en-US" w:bidi="ar-SA"/>
               </w:rPr>
-              <w:t>Номер урока</w:t>
+              <w:t>Тема урока</w:t>
             </w:r>
           </w:p>
         </w:tc>
@@ -240,7 +240,7 @@
                 <w:szCs w:val="22"/>
                 <w:lang w:val="en-US" w:eastAsia="en-US" w:bidi="ar-SA"/>
               </w:rPr>
-              <w:t>1</w:t>
+              <w:t>Что такое контроль версий. Установка Git и первая настройка</w:t>
             </w:r>
           </w:p>
         </w:tc>
@@ -1546,7 +1546,7 @@
         <w:rPr/>
         <w:drawing>
           <wp:inline distT="0" distB="0" distL="0" distR="0">
-            <wp:extent cx="3401060" cy="7425690"/>
+            <wp:extent cx="5486400" cy="4390685"/>
             <wp:effectExtent l="0" t="0" r="0" b="0"/>
             <wp:docPr id="3" name="Image3"/>
             <wp:cNvGraphicFramePr>
@@ -1563,7 +1563,6 @@
                   </pic:nvPicPr>
                   <pic:blipFill>
                     <a:blip r:embed="rId4"/>
-                    <a:srcRect l="3493" t="698" r="0" b="0"/>
                     <a:stretch>
                       <a:fillRect/>
                     </a:stretch>
@@ -1571,7 +1570,7 @@
                   <pic:spPr bwMode="auto">
                     <a:xfrm>
                       <a:off x="0" y="0"/>
-                      <a:ext cx="3401060" cy="7425690"/>
+                      <a:ext cx="5486400" cy="4390685"/>
                     </a:xfrm>
                     <a:prstGeom prst="rect">
                       <a:avLst/>
@@ -2764,7 +2763,7 @@
       </w:pPr>
       <w:r>
         <w:rPr/>
-        <w:t>Способы помощи</w:t>
+        <w:t>Способы помощи учащимся</w:t>
       </w:r>
     </w:p>
     <w:p>
@@ -2840,7 +2839,7 @@
       </w:pPr>
       <w:r>
         <w:rPr/>
-        <w:t>Дополнительные задания для тех, кто справился раньше</w:t>
+        <w:t>Дополнительные задания (для тех, кто справился раньше)</w:t>
       </w:r>
     </w:p>
     <w:p>

</xml_diff>

<commit_message>
docs: final read-through, unify informal address
- Convert all student-facing text in lessons 1-8 to informal "ты"
  (both docs pages and content drafts); keep teacher notes formal.
- Sync lesson 8 wording across strategy, preparation and module
  structure (shared class site on GitHub Pages).
- Simplify long sentences, drop duplication and AI-style filler.
</commit_message>
<xml_diff>
--- a/modules/git-github/content/lesson_01.docx
+++ b/modules/git-github/content/lesson_01.docx
@@ -953,7 +953,7 @@
       </w:pPr>
       <w:r>
         <w:rPr/>
-        <w:t>Git — это программа, которая следит за изменениями в папке с проектом. Она запоминает каждое сохранение (его называют «коммит»), позволяет вернуться к любой прошлой версии и показывает, что именно поменялось. Git работает через команды, которые мы набираем в специальном окне — терминале. Это как машина времени для ваших файлов.</w:t>
+        <w:t>Git — это программа, которая следит за изменениями в папке с проектом. Она запоминает каждое сохранение (его называют «коммит»), позволяет вернуться к любой прошлой версии и показывает, что именно поменялось. Git работает через команды, которые мы набираем в специальном окне — терминале. Это как машина времени для твоих файлов.</w:t>
       </w:r>
     </w:p>
     <w:p>
@@ -1038,7 +1038,7 @@
       </w:pPr>
       <w:r>
         <w:rPr/>
-        <w:t>Откуда же взялось само название «git»? Линус Торвальдс придумал его в шутку. В британском английском словом «git» в разговоре называют вредного, упрямого человека — примерно как у нас сказали бы «ворчун» или «зануда». Линус пошутил, что называет свои программы в свою честь: сначала была Linux, а теперь git. Есть и более «серьёзное» объяснение: эти три буквы можно расшифровать как Global Information Tracker — «глобальный отслеживатель информации». Какое объяснение выбрать, каждый решает сам, но короткое слово из трёх букв запомнить точно легко.</w:t>
+        <w:t>Откуда же взялось само название «git»? Линус Торвальдс придумал его в шутку. В британском английском словом «git» в разговоре называют вредного, упрямого человека — примерно как у нас сказали бы «ворчун» или «зануда». Линус пошутил, что называет свои программы в свою честь: сначала была Linux, а теперь git. Есть и более «серьёзное» объяснение: эти три буквы можно расшифровать как Global Information Tracker — «глобальный отслеживатель информации».</w:t>
       </w:r>
     </w:p>
     <w:p>
@@ -1228,7 +1228,7 @@
       </w:pPr>
       <w:r>
         <w:rPr/>
-        <w:t>Откройте браузер и в адресной строке введите: git-scm.com</w:t>
+        <w:t>Открой браузер и в адресной строке введи: git-scm.com</w:t>
       </w:r>
     </w:p>
     <w:p>
@@ -1242,7 +1242,7 @@
       </w:pPr>
       <w:r>
         <w:rPr/>
-        <w:t>На главной странице нажмите кнопку «Download for Windows».</w:t>
+        <w:t>На главной странице нажми кнопку «Download for Windows».</w:t>
       </w:r>
     </w:p>
     <w:p>
@@ -1256,7 +1256,7 @@
       </w:pPr>
       <w:r>
         <w:rPr/>
-        <w:t>Выберите «64-bit Git for Windows Setup» — начнётся скачивание файла.</w:t>
+        <w:t>Выбери «64-bit Git for Windows Setup» — начнётся скачивание файла.</w:t>
       </w:r>
     </w:p>
     <w:p>
@@ -1270,7 +1270,7 @@
       </w:pPr>
       <w:r>
         <w:rPr/>
-        <w:t>Внизу окна браузера или в папке «Загрузки» найдите скачанный файл (его имя начинается со слова Git и заканчивается на .exe).</w:t>
+        <w:t>Внизу окна браузера или в папке «Загрузки» найди скачанный файл (его имя начинается со слова Git и заканчивается на .exe).</w:t>
       </w:r>
     </w:p>
     <w:p>
@@ -1377,7 +1377,7 @@
       </w:pPr>
       <w:r>
         <w:rPr/>
-        <w:t>Дважды щёлкните по скачанному файлу установщика Git.</w:t>
+        <w:t>Дважды щёлкни по скачанному файлу установщика Git.</w:t>
       </w:r>
     </w:p>
     <w:p>
@@ -1391,7 +1391,7 @@
       </w:pPr>
       <w:r>
         <w:rPr/>
-        <w:t>Если Windows спросит «Разрешить этому приложению вносить изменения?» (окно UAC) — нажмите «Да».</w:t>
+        <w:t>Если Windows спросит «Разрешить этому приложению вносить изменения?» (окно UAC) — нажми «Да».</w:t>
       </w:r>
     </w:p>
     <w:p>
@@ -1405,7 +1405,7 @@
       </w:pPr>
       <w:r>
         <w:rPr/>
-        <w:t>Во всех окнах установщика нажимайте кнопку «Next», не меняя настройки.</w:t>
+        <w:t>Во всех окнах установщика нажимай кнопку «Next», не меняя настройки.</w:t>
       </w:r>
     </w:p>
     <w:p>
@@ -1419,7 +1419,7 @@
       </w:pPr>
       <w:r>
         <w:rPr/>
-        <w:t>На последнем шаге нажмите «Install» и дождитесь окончания установки.</w:t>
+        <w:t>На последнем шаге нажми «Install» и дождись окончания установки.</w:t>
       </w:r>
     </w:p>
     <w:p>
@@ -1433,7 +1433,7 @@
       </w:pPr>
       <w:r>
         <w:rPr/>
-        <w:t>Нажмите «Finish». Если стоит галочка про заметки о версии — её можно снять.</w:t>
+        <w:t>Нажми «Finish». Если стоит галочка про заметки о версии — её можно снять.</w:t>
       </w:r>
     </w:p>
     <w:p>
@@ -1501,7 +1501,7 @@
       </w:pPr>
       <w:r>
         <w:rPr/>
-        <w:t>Нажмите кнопку «Пуск» и начните печатать: Git Bash.</w:t>
+        <w:t>Нажми кнопку «Пуск» и начни печатать: Git Bash.</w:t>
       </w:r>
     </w:p>
     <w:p>
@@ -1515,7 +1515,7 @@
       </w:pPr>
       <w:r>
         <w:rPr/>
-        <w:t>В списке найдите приложение «Git Bash» и откройте его — появится чёрное окно терминала.</w:t>
+        <w:t>В списке найди приложение «Git Bash» и открой его — появится чёрное окно терминала.</w:t>
       </w:r>
     </w:p>
     <w:p>
@@ -1651,7 +1651,7 @@
       </w:pPr>
       <w:r>
         <w:rPr/>
-        <w:t>Наберите команду: git -v и нажмите Enter.</w:t>
+        <w:t>Набери команду: git -v и нажми Enter.</w:t>
       </w:r>
     </w:p>
     <w:p>
@@ -1665,7 +1665,7 @@
       </w:pPr>
       <w:r>
         <w:rPr/>
-        <w:t>Прочитайте ответ — в строке должно появиться слово git и номер версии (например, git version 2.45.0).</w:t>
+        <w:t>Прочитай ответ — в строке должно появиться слово git и номер версии (например, git version 2.45.0).</w:t>
       </w:r>
     </w:p>
     <w:p>
@@ -1775,7 +1775,7 @@
       </w:r>
       <w:r>
         <w:rPr/>
-        <w:t>Git подписывает каждое сохранение именем автора, поэтому ему нужно один раз сообщить, кто вы. Эти данные настраиваются командой git config и потом используются во всех проектах.</w:t>
+        <w:t>Git подписывает каждое сохранение именем автора, поэтому ему нужно один раз сообщить, кто ты. Эти данные настраиваются командой git config и потом используются во всех проектах.</w:t>
       </w:r>
     </w:p>
     <w:p>
@@ -1801,7 +1801,7 @@
       </w:pPr>
       <w:r>
         <w:rPr/>
-        <w:t>В Git Bash наберите команду (вместо Ivan Petrov впишите своё имя латиницей в кавычках): git config --global user.name "Ivan Petrov" и нажмите Enter.</w:t>
+        <w:t>В Git Bash набери команду (вместо Ivan Petrov впиши своё имя латиницей в кавычках): git config --global user.name "Ivan Petrov" и нажми Enter.</w:t>
       </w:r>
     </w:p>
     <w:p>
@@ -1815,7 +1815,7 @@
       </w:pPr>
       <w:r>
         <w:rPr/>
-        <w:t>Следующей командой задайте e-mail: git config --global user.email "ivan@example.com" — впишите свой e-mail. Нажмите Enter.</w:t>
+        <w:t>Следующей командой задай e-mail: git config --global user.email "ivan@example.com" — впиши свой e-mail. Нажми Enter.</w:t>
       </w:r>
     </w:p>
     <w:p>
@@ -1829,7 +1829,7 @@
       </w:pPr>
       <w:r>
         <w:rPr/>
-        <w:t>Проверьте настройки командой: git config -l</w:t>
+        <w:t>Проверь настройки командой: git config -l</w:t>
       </w:r>
     </w:p>
     <w:p>
@@ -1843,7 +1843,7 @@
       </w:pPr>
       <w:r>
         <w:rPr/>
-        <w:t>Найдите в списке строки user.name и user.email — в них должны быть ваши данные.</w:t>
+        <w:t>Найди в списке строки user.name и user.email — в них должны быть твои данные.</w:t>
       </w:r>
     </w:p>
     <w:p>
@@ -1975,7 +1975,7 @@
       </w:pPr>
       <w:r>
         <w:rPr/>
-        <w:t>Откройте браузер и перейдите на сайт: code.visualstudio.com</w:t>
+        <w:t>Открой браузер и перейди на сайт: code.visualstudio.com</w:t>
       </w:r>
     </w:p>
     <w:p>
@@ -2045,7 +2045,7 @@
       </w:pPr>
       <w:r>
         <w:rPr/>
-        <w:t>Нажмите большую кнопку «Download for Windows».</w:t>
+        <w:t>Нажми большую кнопку «Download for Windows».</w:t>
       </w:r>
     </w:p>
     <w:p>
@@ -2059,7 +2059,7 @@
       </w:pPr>
       <w:r>
         <w:rPr/>
-        <w:t>Запустите скачанный установщик, в окне UAC нажмите «Да».</w:t>
+        <w:t>Запусти скачанный установщик, в окне UAC нажми «Да».</w:t>
       </w:r>
     </w:p>
     <w:p>
@@ -2073,7 +2073,7 @@
       </w:pPr>
       <w:r>
         <w:rPr/>
-        <w:t>Примите условия лицензии, затем нажимайте «Next», а в конце — «Install».</w:t>
+        <w:t>Прими условия лицензии, затем нажимай «Next», а в конце — «Install».</w:t>
       </w:r>
     </w:p>
     <w:p>
@@ -2087,7 +2087,7 @@
       </w:pPr>
       <w:r>
         <w:rPr/>
-        <w:t>После установки нажмите «Finish» — VS Code откроется. Закройте вкладку приветствия.</w:t>
+        <w:t>После установки нажми «Finish» — VS Code откроется. Закрой вкладку приветствия.</w:t>
       </w:r>
     </w:p>
     <w:p>
@@ -2689,7 +2689,7 @@
       </w:pPr>
       <w:r>
         <w:rPr/>
-        <w:t>Окно UAC «Разрешить вносить изменения?» пугает учеников — заранее объяснить, что нужно нажать «Да».</w:t>
+        <w:t>Установка Git: окно UAC и обилие экранов установщика пугают новичков — подробнее в заметке «Где чаще всего теряются» в практической части (UAC — «Да», в установщике — просто «Next»).</w:t>
       </w:r>
     </w:p>
     <w:p>
@@ -2703,7 +2703,7 @@
       </w:pPr>
       <w:r>
         <w:rPr/>
-        <w:t>Большое число экранов в установщике Git — ученики теряются и начинают менять настройки. Предупредить: просто «Next».</w:t>
+        <w:t>Ввод команд в терминал: опечатки, пропущенные дефисы, неправильные кавычки. Самая частая ошибка на этом уроке.</w:t>
       </w:r>
     </w:p>
     <w:p>
@@ -2717,7 +2717,7 @@
       </w:pPr>
       <w:r>
         <w:rPr/>
-        <w:t>Ввод команд в терминал: опечатки, пропущенные дефисы, неправильные кавычки. Самая частая ошибка на этом уроке.</w:t>
+        <w:t>Вставка в Git Bash: Ctrl+V не работает, нужна правая кнопка мыши.</w:t>
       </w:r>
     </w:p>
     <w:p>
@@ -2731,7 +2731,35 @@
       </w:pPr>
       <w:r>
         <w:rPr/>
-        <w:t>Вставка в Git Bash: Ctrl+V не работает, нужна правая кнопка мыши.</w:t>
+        <w:t xml:space="preserve">На школьных компьютерах может не быть прав </w:t>
+      </w:r>
+      <w:r>
+        <w:rPr/>
+        <w:t>администратора</w:t>
+      </w:r>
+      <w:r>
+        <w:rPr/>
+        <w:t xml:space="preserve"> — тогда Git и VS Code должен установить тьютор заранее.</w:t>
+      </w:r>
+    </w:p>
+    <w:p>
+      <w:pPr>
+        <w:pStyle w:val="Heading3"/>
+        <w:rPr/>
+      </w:pPr>
+      <w:r>
+        <w:rPr/>
+        <w:t>Способы помощи учащимся</w:t>
+      </w:r>
+    </w:p>
+    <w:p>
+      <w:pPr>
+        <w:pStyle w:val="Normal"/>
+        <w:rPr/>
+      </w:pPr>
+      <w:r>
+        <w:rPr/>
+        <w:t>Помогать каскадом подсказок, не давая сразу готовый ответ:</w:t>
       </w:r>
     </w:p>
     <w:p>
@@ -2745,35 +2773,7 @@
       </w:pPr>
       <w:r>
         <w:rPr/>
-        <w:t xml:space="preserve">На школьных компьютерах может не быть прав </w:t>
-      </w:r>
-      <w:r>
-        <w:rPr/>
-        <w:t>администратора</w:t>
-      </w:r>
-      <w:r>
-        <w:rPr/>
-        <w:t xml:space="preserve"> — тогда Git и VS Code должен установить тьютор заранее.</w:t>
-      </w:r>
-    </w:p>
-    <w:p>
-      <w:pPr>
-        <w:pStyle w:val="Heading3"/>
-        <w:rPr/>
-      </w:pPr>
-      <w:r>
-        <w:rPr/>
-        <w:t>Способы помощи учащимся</w:t>
-      </w:r>
-    </w:p>
-    <w:p>
-      <w:pPr>
-        <w:pStyle w:val="Normal"/>
-        <w:rPr/>
-      </w:pPr>
-      <w:r>
-        <w:rPr/>
-        <w:t>Помогать каскадом подсказок, не давая сразу готовый ответ:</w:t>
+        <w:t>Подсказка 1 (общая): «Перечитай шаг в инструкции вслух. Какое именно слово или символ ты набрал по-другому?»</w:t>
       </w:r>
     </w:p>
     <w:p>
@@ -2787,7 +2787,7 @@
       </w:pPr>
       <w:r>
         <w:rPr/>
-        <w:t>Подсказка 1 (общая): «Перечитай шаг в инструкции вслух. Какое именно слово или символ ты набрал по-другому?»</w:t>
+        <w:t>Подсказка 2 (конкретнее): «Сравни свою команду с командой на экране по буквам — обрати внимание на два дефиса и кавычки».</w:t>
       </w:r>
     </w:p>
     <w:p>
@@ -2801,7 +2801,7 @@
       </w:pPr>
       <w:r>
         <w:rPr/>
-        <w:t>Подсказка 2 (конкретнее): «Сравни свою команду с командой на экране по буквам — обрати внимание на два дефиса и кавычки».</w:t>
+        <w:t>Подсказка 3 (процедурная): показать на проекторе правильный ввод этой же команды и попросить повторить.</w:t>
       </w:r>
     </w:p>
     <w:p>
@@ -2815,7 +2815,17 @@
       </w:pPr>
       <w:r>
         <w:rPr/>
-        <w:t>Подсказка 3 (процедурная): показать на проекторе правильный ввод этой же команды и попросить повторить.</w:t>
+        <w:t>Если ученик застрял на открытии Git Bash — показать поиск через «Пуск» и набор слова Git Bash.</w:t>
+      </w:r>
+    </w:p>
+    <w:p>
+      <w:pPr>
+        <w:pStyle w:val="Heading3"/>
+        <w:rPr/>
+      </w:pPr>
+      <w:r>
+        <w:rPr/>
+        <w:t>Дополнительные задания (для тех, кто справился раньше)</w:t>
       </w:r>
     </w:p>
     <w:p>
@@ -2829,17 +2839,7 @@
       </w:pPr>
       <w:r>
         <w:rPr/>
-        <w:t>Если ученик застрял на открытии Git Bash — показать поиск через «Пуск» и набор слова Git Bash.</w:t>
-      </w:r>
-    </w:p>
-    <w:p>
-      <w:pPr>
-        <w:pStyle w:val="Heading3"/>
-        <w:rPr/>
-      </w:pPr>
-      <w:r>
-        <w:rPr/>
-        <w:t>Дополнительные задания (для тех, кто справился раньше)</w:t>
+        <w:t>Выполнить команду git -h и посмотреть, сколько у Git команд. Назвать две незнакомые.</w:t>
       </w:r>
     </w:p>
     <w:p>
@@ -2853,21 +2853,7 @@
       </w:pPr>
       <w:r>
         <w:rPr/>
-        <w:t>Выполнить команду git -h и посмотреть, сколько у Git команд. Назвать две незнакомые.</w:t>
-      </w:r>
-    </w:p>
-    <w:p>
-      <w:pPr>
-        <w:pStyle w:val="ListBullet"/>
-        <w:numPr>
-          <w:ilvl w:val="0"/>
-          <w:numId w:val="1"/>
-        </w:numPr>
-        <w:rPr/>
-      </w:pPr>
-      <w:r>
-        <w:rPr/>
-        <w:t>Поиграйте с терминалом Git Bash: введите команду cal — появится календарь текущего месяца, а команда date покажет точные дату и время. Найдите в календаре день своего рождения.</w:t>
+        <w:t>Поиграй с терминалом Git Bash: введи команду cal — появится календарь текущего месяца, а команда date покажет точные дату и время. Найди в календаре день своего рождения.</w:t>
       </w:r>
     </w:p>
     <w:p>
@@ -2883,7 +2869,7 @@
       </w:pPr>
       <w:r>
         <w:rPr/>
-        <w:t>Сделайте сообщения Git цветными: выполните команду git config --global color.ui auto, затем проверьте настройки командой git config -l и найдите новую строку color.ui — теперь подсказки Git будут раскрашиваться.</w:t>
+        <w:t>Сделай сообщения Git цветными: выполни команду git config --global color.ui auto, затем проверь настройки командой git config -l и найди новую строку color.ui — теперь подсказки Git будут раскрашиваться.</w:t>
       </w:r>
     </w:p>
     <w:sectPr>

</xml_diff>